<commit_message>
Revise the deployment report around the published site.
The figures now show the live recommendation on bitewise-ai.ai.studio and the GitHub repository, without a local editor.

Co-authored-by: zengpu29 <zengpu29@gmail.com>
</commit_message>
<xml_diff>
--- a/DEPLOYMENT_REPORT.docx
+++ b/DEPLOYMENT_REPORT.docx
@@ -64,7 +64,7 @@
           <w:color w:val="000000"/>
           <w:sz w:val="24"/>
         </w:rPr>
-        <w:t>Publishing BiteWise AI at a Public Web Address</w:t>
+        <w:t>BiteWise AI on Its Published Address</w:t>
       </w:r>
     </w:p>
     <w:p>
@@ -193,7 +193,7 @@
           <w:color w:val="000000"/>
           <w:sz w:val="24"/>
         </w:rPr>
-        <w:t>Publishing BiteWise AI at a Public Web Address</w:t>
+        <w:t>BiteWise AI on Its Published Address</w:t>
       </w:r>
     </w:p>
     <w:p>
@@ -210,7 +210,7 @@
           <w:color w:val="000000"/>
           <w:sz w:val="24"/>
         </w:rPr>
-        <w:t>BiteWise AI, the second application, is public at https://bitewise-ai.ai.studio. Figure 1 shows that address on October 18, 2026, at 8:11 a.m. UTC. The clock in the corner is the desktop clock. The page is the BiteWise home screen, including the notice that the app does not place orders. The same morning, /api/health returned ok true, service bitewise-ai, demoMode false, and rankingModel gemini-3.8-flash. demoMode false means the published process has a Gemini key. That key is not in the GitHub repository.</w:t>
+        <w:t>This paper records the published BiteWise site, https://bitewise-ai.ai.studio. Figure 1 is that site on October 18, 2026, at 8:22 a.m. UTC. The clock in the corner is the desktop clock, and the address bar is bitewise-ai.ai.studio. The request on the page was “light vegetarian dinner under 15,” with a maximum budget of 15 and Vegetarian checked. The published page reported 15 eligible meals at or under $15.00 and the required label vegetarian. The cards on screen were Tofu Miso Soup from Hana Bowl at $6.50 and Garlic Bok Choy from Lantern Noodle House at $9.00. The same published request also returned Dal Tadka with Rice at $11. The badge read “Fallback ranking.” The page said Gemini was unavailable or returned a ranking that did not match the menu.</w:t>
       </w:r>
     </w:p>
     <w:p>
@@ -245,7 +245,7 @@
           <w:color w:val="000000"/>
           <w:sz w:val="24"/>
         </w:rPr>
-        <w:t>The live address is https://bitewise-ai.ai.studio. There is no https://example.awsapprunner.com address for this app. AWS no longer opens App Runner to new customers and points new container apps to Amazon ECS Express Mode. The classmate site used as the pattern, https://clearpath-claims-knowledge-assistant.ai.studio/, is an Express app behind Google Frontend. BiteWise was published the same way: the live response headers name Google Frontend, and Express serves the pages. No App Runner console shows a first service and a second service both Running. That screenshot is omitted, because a stand-in image would misstate where the app is hosted.</w:t>
+        <w:t>The live address is https://bitewise-ai.ai.studio. There is no https://example.awsapprunner.com address. AWS no longer opens App Runner to new customers. The classmate pattern, https://clearpath-claims-knowledge-assistant.ai.studio/, is an Express app behind Google Frontend, and BiteWise answers from that same kind of host. Headers on the BiteWise address name Google Frontend. https://bitewise-ai.ai.studio/api/health returned ok true, service bitewise-ai, demoMode false, and rankingModel gemini-3.8-flash. The recommendation response also had demoMode false, so the public page did not show the demo-mode label. The Gemini key is not in the GitHub repository. No App Runner console shows two services Running, and no stand-in image is included.</w:t>
       </w:r>
     </w:p>
     <w:p>
@@ -280,7 +280,7 @@
           <w:color w:val="000000"/>
           <w:sz w:val="24"/>
         </w:rPr>
-        <w:t>npm run build writes the React client. npm start serves that build and the Express API from one process, listening on PORT, which this host sets to 8080. Routes such as /explore return index.html. Routes under /api stay JSON. A Dockerfile runs the install, the build, and npm start. Figure 2 shows https://github.com/puzeng/AIML505_BiteWise at 8:10 a.m. UTC. Main is commit ec7a9a8, “Serve the built web app from the API for Cloud Run.” Publish rebuilds the client, so the live script name is not the hash of a local build made before publish. The assistant ran the API tests, 12 passed, then requested the live health check.</w:t>
+        <w:t>The published host serves the React pages and the /api routes from one address. A recommendation, the menu filters, and the health check all used https://bitewise-ai.ai.studio. Figure 2 shows the repository https://github.com/puzeng/AIML505_BiteWise at 8:22 a.m. UTC the same morning. Main is commit 12c953d. The file list includes client, server, the Dockerfile, and this report. Publish rebuilds the client, so Figure 1 is the deployed bundle.</w:t>
       </w:r>
     </w:p>
     <w:p>
@@ -315,7 +315,7 @@
           <w:color w:val="000000"/>
           <w:sz w:val="24"/>
         </w:rPr>
-        <w:t>StudyCite, the first app, is the React and Vite prototype at https://github.com/puzeng/AIML515_StudyCite. Its README describes a client-side retrieve, rerank, and cited answer or abstention. The header switches study TL-301 or TL-204, and a site coordinator is limited to TL-301. The file apprunner.yaml builds with npm ci and npm run build, then starts the Vite preview server on port 8080. That README lists no public App Runner address, so this paper does not invent one and does not claim which deployment used less clock time. BiteWise was simpler in shape: one process and one URL serve the pages and the API. StudyCite’s preview command serves only the front end. Recommendations, favorites, and menu filters stay on the BiteWise server, so production could not be a second dev server.</w:t>
+        <w:t>StudyCite, the first app, is the React and Vite prototype at https://github.com/puzeng/AIML515_StudyCite. Its README describes a client-side retrieve, rerank, and cited answer or abstention, with studies TL-301 and TL-204. A site coordinator is limited to TL-301. Its apprunner.yaml starts a Vite preview server. That README lists no public address, so this paper does not invent one and does not compare clock times. On BiteWise, the check in Figure 1 and the health check used one public URL. The published server applied the budget and the vegetarian label before it returned meals.</w:t>
       </w:r>
     </w:p>
     <w:p>
@@ -350,7 +350,7 @@
           <w:color w:val="000000"/>
           <w:sz w:val="24"/>
         </w:rPr>
-        <w:t>The requested App Runner service could not be created for a new account. The path that worked was the ClearPath publish step, which produced https://bitewise-ai.ai.studio. The API content-security policy, default-src none, would have blocked the app’s scripts and font stylesheet. Page responses now allow the site’s own scripts and styles plus the Google font hosts, and /api stays locked down. An earlier GitHub sign-in code expired before the serving commit could upload. After a new approval, main matched ec7a9a8, the tree in Figure 2. The assistant did not invent an App Runner URL, a console screenshot, or a duration for the StudyCite deployment.</w:t>
+        <w:t>A new App Runner service could not be created. The address that is actually running is https://bitewise-ai.ai.studio. On that published site, Gemini did not return a usable ranking for the vegetarian request, so the page kept the filtered meals and said why. That result is Figure 1. The published pages also needed a content-security policy that allows the app’s scripts and the Google font hosts. The API policy, default-src none, would have left the public screen blank. Figure 2 is the GitHub repository for that published app.</w:t>
       </w:r>
       <w:r>
         <w:rPr>
@@ -394,7 +394,7 @@
           <w:color w:val="000000"/>
           <w:sz w:val="24"/>
         </w:rPr>
-        <w:t>BiteWise AI Open at the Public Address</w:t>
+        <w:t>Published BiteWise Recommendation</w:t>
       </w:r>
     </w:p>
     <w:p>
@@ -461,7 +461,7 @@
           <w:color w:val="000000"/>
           <w:sz w:val="24"/>
         </w:rPr>
-        <w:t>The desktop clock reads 8:11 a.m. on October 18, 2026, UTC. The browser address is https://bitewise-ai.ai.studio, and the page is the BiteWise home screen.</w:t>
+        <w:t>The desktop clock reads 8:22 a.m. on October 18, 2026, UTC. The address is https://bitewise-ai.ai.studio. The page shows Fallback ranking, 15 eligible meals at or under $15, and Tofu Miso Soup at $6.50.</w:t>
       </w:r>
       <w:r>
         <w:rPr>
@@ -572,7 +572,7 @@
           <w:color w:val="000000"/>
           <w:sz w:val="24"/>
         </w:rPr>
-        <w:t>The desktop clock reads 8:10 a.m. on October 18, 2026, UTC. The browser is https://github.com/puzeng/AIML505_BiteWise on main, showing client, server, tests, and the Dockerfile. A local editor is also open on the desktop.</w:t>
+        <w:t>The desktop clock reads 8:22 a.m. on October 18, 2026, UTC. The browser is https://github.com/puzeng/AIML505_BiteWise on main at commit 12c953d. The capture shows the repository only.</w:t>
       </w:r>
     </w:p>
     <w:sectPr>

</xml_diff>